<commit_message>
feat -- NI: add the code
</commit_message>
<xml_diff>
--- a/42SI Stvorennja IDE/4/SI_KNT-122_Onyshchenko_19_PR4.docx
+++ b/42SI Stvorennja IDE/4/SI_KNT-122_Onyshchenko_19_PR4.docx
@@ -1616,6 +1616,19 @@
     <w:basedOn w:val="Normal"/>
     <w:qFormat/>
     <w:pPr/>
+    <w:rPr/>
+  </w:style>
+  <w:style w:type="paragraph" w:styleId="Header">
+    <w:name w:val="header"/>
+    <w:basedOn w:val="Style15"/>
+    <w:pPr>
+      <w:suppressLineNumbers/>
+      <w:tabs>
+        <w:tab w:val="clear" w:pos="851"/>
+        <w:tab w:val="center" w:pos="4513" w:leader="none"/>
+        <w:tab w:val="right" w:pos="9026" w:leader="none"/>
+      </w:tabs>
+    </w:pPr>
     <w:rPr/>
   </w:style>
   <w:style w:type="numbering" w:styleId="user4">

</xml_diff>

<commit_message>
feat -- D: fill in the presentation
</commit_message>
<xml_diff>
--- a/42SI Stvorennja IDE/4/SI_KNT-122_Onyshchenko_19_PR4.docx
+++ b/42SI Stvorennja IDE/4/SI_KNT-122_Onyshchenko_19_PR4.docx
@@ -834,7 +834,7 @@
     <w:pPr>
       <w:widowControl/>
       <w:suppressAutoHyphens w:val="true"/>
-      <w:overflowPunct w:val="false"/>
+      <w:overflowPunct w:val="true"/>
       <w:bidi w:val="0"/>
       <w:spacing w:lineRule="auto" w:line="360" w:before="0" w:after="0"/>
       <w:ind w:firstLine="851"/>
@@ -1173,12 +1173,12 @@
       <w:lang w:val="en-US" w:eastAsia="uk-UA"/>
     </w:rPr>
   </w:style>
-  <w:style w:type="character" w:styleId="user">
-    <w:name w:val="Символ нумерації (user)"/>
-    <w:qFormat/>
-    <w:rPr/>
-  </w:style>
-  <w:style w:type="paragraph" w:styleId="Style12">
+  <w:style w:type="character" w:styleId="Style12">
+    <w:name w:val="Символ нумерації"/>
+    <w:qFormat/>
+    <w:rPr/>
+  </w:style>
+  <w:style w:type="paragraph" w:styleId="Style13">
     <w:name w:val="Заголовок"/>
     <w:basedOn w:val="Normal"/>
     <w:next w:val="BodyText"/>
@@ -1188,7 +1188,7 @@
       <w:spacing w:before="240" w:after="120"/>
     </w:pPr>
     <w:rPr>
-      <w:rFonts w:ascii="Liberation Sans" w:hAnsi="Liberation Sans" w:eastAsia="Microsoft YaHei" w:cs="Arial Unicode MS"/>
+      <w:rFonts w:ascii="Liberation Sans" w:hAnsi="Liberation Sans" w:eastAsia="Microsoft YaHei" w:cs="Lucida Sans"/>
       <w:sz w:val="28"/>
       <w:szCs w:val="28"/>
     </w:rPr>
@@ -1225,7 +1225,7 @@
       <w:szCs w:val="24"/>
     </w:rPr>
   </w:style>
-  <w:style w:type="paragraph" w:styleId="Style13">
+  <w:style w:type="paragraph" w:styleId="Style14">
     <w:name w:val="Покажчик"/>
     <w:basedOn w:val="Normal"/>
     <w:qFormat/>
@@ -1233,10 +1233,10 @@
       <w:suppressLineNumbers/>
     </w:pPr>
     <w:rPr>
-      <w:rFonts w:cs="Arial Unicode MS"/>
-    </w:rPr>
-  </w:style>
-  <w:style w:type="paragraph" w:styleId="user1">
+      <w:rFonts w:cs="Lucida Sans"/>
+    </w:rPr>
+  </w:style>
+  <w:style w:type="paragraph" w:styleId="user">
     <w:name w:val="Заголовок (user)"/>
     <w:basedOn w:val="Normal"/>
     <w:next w:val="BodyText"/>
@@ -1246,12 +1246,12 @@
       <w:spacing w:before="240" w:after="120"/>
     </w:pPr>
     <w:rPr>
-      <w:rFonts w:ascii="Liberation Sans" w:hAnsi="Liberation Sans" w:eastAsia="Microsoft YaHei" w:cs="Lucida Sans"/>
+      <w:rFonts w:ascii="Liberation Sans" w:hAnsi="Liberation Sans" w:eastAsia="Microsoft YaHei" w:cs="Arial Unicode MS"/>
       <w:sz w:val="28"/>
       <w:szCs w:val="28"/>
     </w:rPr>
   </w:style>
-  <w:style w:type="paragraph" w:styleId="user2">
+  <w:style w:type="paragraph" w:styleId="user1">
     <w:name w:val="Покажчик (user)"/>
     <w:basedOn w:val="Normal"/>
     <w:qFormat/>
@@ -1259,12 +1259,12 @@
       <w:suppressLineNumbers/>
     </w:pPr>
     <w:rPr>
-      <w:rFonts w:cs="Lucida Sans"/>
+      <w:rFonts w:cs="Arial Unicode MS"/>
     </w:rPr>
   </w:style>
   <w:style w:type="paragraph" w:styleId="IndexHeading">
     <w:name w:val="index heading"/>
-    <w:basedOn w:val="Style12"/>
+    <w:basedOn w:val="user"/>
     <w:pPr/>
     <w:rPr/>
   </w:style>
@@ -1521,8 +1521,8 @@
     </w:pPr>
     <w:rPr/>
   </w:style>
-  <w:style w:type="paragraph" w:styleId="Style14">
-    <w:name w:val="Верхній і нижній колонтитули"/>
+  <w:style w:type="paragraph" w:styleId="user2">
+    <w:name w:val="Верхній і нижній колонтитули (user)"/>
     <w:basedOn w:val="Normal"/>
     <w:qFormat/>
     <w:pPr>
@@ -1535,8 +1535,8 @@
     </w:pPr>
     <w:rPr/>
   </w:style>
-  <w:style w:type="paragraph" w:styleId="user3">
-    <w:name w:val="Верхній і нижній колонтитули (user)"/>
+  <w:style w:type="paragraph" w:styleId="Style15">
+    <w:name w:val="Верхній і нижній колонтитули"/>
     <w:basedOn w:val="Normal"/>
     <w:qFormat/>
     <w:pPr/>
@@ -1544,14 +1544,14 @@
   </w:style>
   <w:style w:type="paragraph" w:styleId="Footer">
     <w:name w:val="footer"/>
-    <w:basedOn w:val="Style14"/>
+    <w:basedOn w:val="user2"/>
     <w:pPr>
       <w:suppressLineNumbers/>
     </w:pPr>
     <w:rPr/>
   </w:style>
-  <w:style w:type="paragraph" w:styleId="Style15">
-    <w:name w:val="Вміст рамки"/>
+  <w:style w:type="paragraph" w:styleId="user3">
+    <w:name w:val="Вміст рамки (user)"/>
     <w:basedOn w:val="Normal"/>
     <w:qFormat/>
     <w:pPr/>
@@ -1559,7 +1559,7 @@
   </w:style>
   <w:style w:type="paragraph" w:styleId="Header">
     <w:name w:val="header"/>
-    <w:basedOn w:val="user3"/>
+    <w:basedOn w:val="Style15"/>
     <w:pPr>
       <w:suppressLineNumbers/>
       <w:tabs>
@@ -1570,8 +1570,8 @@
     </w:pPr>
     <w:rPr/>
   </w:style>
-  <w:style w:type="numbering" w:styleId="Style16">
-    <w:name w:val="Без маркерів"/>
+  <w:style w:type="numbering" w:styleId="user4">
+    <w:name w:val="Без маркерів (user)"/>
     <w:qFormat/>
   </w:style>
 </w:styles>

</xml_diff>

<commit_message>
feat -- SI: please work
</commit_message>
<xml_diff>
--- a/42SI Stvorennja IDE/4/SI_KNT-122_Onyshchenko_19_PR4.docx
+++ b/42SI Stvorennja IDE/4/SI_KNT-122_Onyshchenko_19_PR4.docx
@@ -780,12 +780,805 @@
         <w:rPr>
           <w:color w:val="auto"/>
         </w:rPr>
-        <w:t>Виконання</w:t>
-      </w:r>
-    </w:p>
-    <w:p>
-      <w:pPr>
-        <w:pStyle w:val="h11"/>
+        <w:t>Виконанн</w:t>
+      </w:r>
+      <w:r>
+        <w:rPr>
+          <w:color w:val="auto"/>
+        </w:rPr>
+        <w:t>я</w:t>
+      </w:r>
+    </w:p>
+    <w:p>
+      <w:pPr>
+        <w:pStyle w:val="H2"/>
+        <w:rPr/>
+      </w:pPr>
+      <w:r>
+        <w:rPr/>
+        <w:t>Код</w:t>
+      </w:r>
+    </w:p>
+    <w:p>
+      <w:pPr>
+        <w:pStyle w:val="P1"/>
+        <w:rPr/>
+      </w:pPr>
+      <w:r>
+        <w:rPr/>
+      </w:r>
+    </w:p>
+    <w:p>
+      <w:pPr>
+        <w:pStyle w:val="Code"/>
+        <w:rPr>
+          <w:rFonts w:ascii="Consolas" w:hAnsi="Consolas"/>
+        </w:rPr>
+      </w:pPr>
+      <w:r>
+        <w:rPr>
+          <w:rFonts w:ascii="Consolas" w:hAnsi="Consolas"/>
+        </w:rPr>
+        <w:t>"use client";</w:t>
+      </w:r>
+    </w:p>
+    <w:p>
+      <w:pPr>
+        <w:pStyle w:val="Code"/>
+        <w:rPr>
+          <w:rFonts w:ascii="Consolas" w:hAnsi="Consolas"/>
+        </w:rPr>
+      </w:pPr>
+      <w:r>
+        <w:rPr>
+          <w:rFonts w:ascii="Consolas" w:hAnsi="Consolas"/>
+        </w:rPr>
+      </w:r>
+    </w:p>
+    <w:p>
+      <w:pPr>
+        <w:pStyle w:val="Code"/>
+        <w:rPr>
+          <w:rFonts w:ascii="Consolas" w:hAnsi="Consolas"/>
+        </w:rPr>
+      </w:pPr>
+      <w:r>
+        <w:rPr>
+          <w:rFonts w:ascii="Consolas" w:hAnsi="Consolas"/>
+        </w:rPr>
+        <w:t>import { useState } from "react";</w:t>
+      </w:r>
+    </w:p>
+    <w:p>
+      <w:pPr>
+        <w:pStyle w:val="Code"/>
+        <w:rPr>
+          <w:rFonts w:ascii="Consolas" w:hAnsi="Consolas"/>
+        </w:rPr>
+      </w:pPr>
+      <w:r>
+        <w:rPr>
+          <w:rFonts w:ascii="Consolas" w:hAnsi="Consolas"/>
+        </w:rPr>
+      </w:r>
+    </w:p>
+    <w:p>
+      <w:pPr>
+        <w:pStyle w:val="Code"/>
+        <w:rPr>
+          <w:rFonts w:ascii="Consolas" w:hAnsi="Consolas"/>
+        </w:rPr>
+      </w:pPr>
+      <w:r>
+        <w:rPr>
+          <w:rFonts w:ascii="Consolas" w:hAnsi="Consolas"/>
+        </w:rPr>
+        <w:t>const parse = (value: string) =&gt; {</w:t>
+      </w:r>
+    </w:p>
+    <w:p>
+      <w:pPr>
+        <w:pStyle w:val="Code"/>
+        <w:rPr>
+          <w:rFonts w:ascii="Consolas" w:hAnsi="Consolas"/>
+        </w:rPr>
+      </w:pPr>
+      <w:r>
+        <w:rPr>
+          <w:rFonts w:ascii="Consolas" w:hAnsi="Consolas"/>
+        </w:rPr>
+        <w:t xml:space="preserve">  </w:t>
+      </w:r>
+      <w:r>
+        <w:rPr>
+          <w:rFonts w:ascii="Consolas" w:hAnsi="Consolas"/>
+        </w:rPr>
+        <w:t>const cleanInput = value.replace(/[a-z=;]/gi, "");</w:t>
+      </w:r>
+    </w:p>
+    <w:p>
+      <w:pPr>
+        <w:pStyle w:val="Code"/>
+        <w:rPr>
+          <w:rFonts w:ascii="Consolas" w:hAnsi="Consolas"/>
+        </w:rPr>
+      </w:pPr>
+      <w:r>
+        <w:rPr>
+          <w:rFonts w:ascii="Consolas" w:hAnsi="Consolas"/>
+        </w:rPr>
+        <w:t xml:space="preserve">  </w:t>
+      </w:r>
+      <w:r>
+        <w:rPr>
+          <w:rFonts w:ascii="Consolas" w:hAnsi="Consolas"/>
+        </w:rPr>
+        <w:t>const calculatedInput = eval(cleanInput);</w:t>
+      </w:r>
+    </w:p>
+    <w:p>
+      <w:pPr>
+        <w:pStyle w:val="Code"/>
+        <w:rPr>
+          <w:rFonts w:ascii="Consolas" w:hAnsi="Consolas"/>
+        </w:rPr>
+      </w:pPr>
+      <w:r>
+        <w:rPr>
+          <w:rFonts w:ascii="Consolas" w:hAnsi="Consolas"/>
+        </w:rPr>
+        <w:t xml:space="preserve">  </w:t>
+      </w:r>
+      <w:r>
+        <w:rPr>
+          <w:rFonts w:ascii="Consolas" w:hAnsi="Consolas"/>
+        </w:rPr>
+        <w:t>return calculatedInput;</w:t>
+      </w:r>
+    </w:p>
+    <w:p>
+      <w:pPr>
+        <w:pStyle w:val="Code"/>
+        <w:rPr>
+          <w:rFonts w:ascii="Consolas" w:hAnsi="Consolas"/>
+        </w:rPr>
+      </w:pPr>
+      <w:r>
+        <w:rPr>
+          <w:rFonts w:ascii="Consolas" w:hAnsi="Consolas"/>
+        </w:rPr>
+        <w:t>};</w:t>
+      </w:r>
+    </w:p>
+    <w:p>
+      <w:pPr>
+        <w:pStyle w:val="Code"/>
+        <w:rPr>
+          <w:rFonts w:ascii="Consolas" w:hAnsi="Consolas"/>
+        </w:rPr>
+      </w:pPr>
+      <w:r>
+        <w:rPr>
+          <w:rFonts w:ascii="Consolas" w:hAnsi="Consolas"/>
+        </w:rPr>
+      </w:r>
+    </w:p>
+    <w:p>
+      <w:pPr>
+        <w:pStyle w:val="Code"/>
+        <w:rPr>
+          <w:rFonts w:ascii="Consolas" w:hAnsi="Consolas"/>
+        </w:rPr>
+      </w:pPr>
+      <w:r>
+        <w:rPr>
+          <w:rFonts w:ascii="Consolas" w:hAnsi="Consolas"/>
+        </w:rPr>
+        <w:t>export default function Home() {</w:t>
+      </w:r>
+    </w:p>
+    <w:p>
+      <w:pPr>
+        <w:pStyle w:val="Code"/>
+        <w:rPr>
+          <w:rFonts w:ascii="Consolas" w:hAnsi="Consolas"/>
+        </w:rPr>
+      </w:pPr>
+      <w:r>
+        <w:rPr>
+          <w:rFonts w:ascii="Consolas" w:hAnsi="Consolas"/>
+        </w:rPr>
+        <w:t xml:space="preserve">  </w:t>
+      </w:r>
+      <w:r>
+        <w:rPr>
+          <w:rFonts w:ascii="Consolas" w:hAnsi="Consolas"/>
+        </w:rPr>
+        <w:t>const [value, setValue] = useState&lt;string&gt;("32 + 12 - 11");</w:t>
+      </w:r>
+    </w:p>
+    <w:p>
+      <w:pPr>
+        <w:pStyle w:val="Code"/>
+        <w:rPr>
+          <w:rFonts w:ascii="Consolas" w:hAnsi="Consolas"/>
+        </w:rPr>
+      </w:pPr>
+      <w:r>
+        <w:rPr>
+          <w:rFonts w:ascii="Consolas" w:hAnsi="Consolas"/>
+        </w:rPr>
+        <w:t xml:space="preserve">  </w:t>
+      </w:r>
+      <w:r>
+        <w:rPr>
+          <w:rFonts w:ascii="Consolas" w:hAnsi="Consolas"/>
+        </w:rPr>
+        <w:t>const [result, setResult] = useState&lt;string&gt;("");</w:t>
+      </w:r>
+    </w:p>
+    <w:p>
+      <w:pPr>
+        <w:pStyle w:val="Code"/>
+        <w:rPr>
+          <w:rFonts w:ascii="Consolas" w:hAnsi="Consolas"/>
+        </w:rPr>
+      </w:pPr>
+      <w:r>
+        <w:rPr>
+          <w:rFonts w:ascii="Consolas" w:hAnsi="Consolas"/>
+        </w:rPr>
+      </w:r>
+    </w:p>
+    <w:p>
+      <w:pPr>
+        <w:pStyle w:val="Code"/>
+        <w:rPr>
+          <w:rFonts w:ascii="Consolas" w:hAnsi="Consolas"/>
+        </w:rPr>
+      </w:pPr>
+      <w:r>
+        <w:rPr>
+          <w:rFonts w:ascii="Consolas" w:hAnsi="Consolas"/>
+        </w:rPr>
+        <w:t xml:space="preserve">  </w:t>
+      </w:r>
+      <w:r>
+        <w:rPr>
+          <w:rFonts w:ascii="Consolas" w:hAnsi="Consolas"/>
+        </w:rPr>
+        <w:t>const calculateResult = () =&gt; {</w:t>
+      </w:r>
+    </w:p>
+    <w:p>
+      <w:pPr>
+        <w:pStyle w:val="Code"/>
+        <w:rPr>
+          <w:rFonts w:ascii="Consolas" w:hAnsi="Consolas"/>
+        </w:rPr>
+      </w:pPr>
+      <w:r>
+        <w:rPr>
+          <w:rFonts w:ascii="Consolas" w:hAnsi="Consolas"/>
+        </w:rPr>
+        <w:t xml:space="preserve">    </w:t>
+      </w:r>
+      <w:r>
+        <w:rPr>
+          <w:rFonts w:ascii="Consolas" w:hAnsi="Consolas"/>
+        </w:rPr>
+        <w:t>const givenResult = parse(value);</w:t>
+      </w:r>
+    </w:p>
+    <w:p>
+      <w:pPr>
+        <w:pStyle w:val="Code"/>
+        <w:rPr>
+          <w:rFonts w:ascii="Consolas" w:hAnsi="Consolas"/>
+        </w:rPr>
+      </w:pPr>
+      <w:r>
+        <w:rPr>
+          <w:rFonts w:ascii="Consolas" w:hAnsi="Consolas"/>
+        </w:rPr>
+        <w:t xml:space="preserve">    </w:t>
+      </w:r>
+      <w:r>
+        <w:rPr>
+          <w:rFonts w:ascii="Consolas" w:hAnsi="Consolas"/>
+        </w:rPr>
+        <w:t>setResult(givenResult);</w:t>
+      </w:r>
+    </w:p>
+    <w:p>
+      <w:pPr>
+        <w:pStyle w:val="Code"/>
+        <w:rPr>
+          <w:rFonts w:ascii="Consolas" w:hAnsi="Consolas"/>
+        </w:rPr>
+      </w:pPr>
+      <w:r>
+        <w:rPr>
+          <w:rFonts w:ascii="Consolas" w:hAnsi="Consolas"/>
+        </w:rPr>
+        <w:t xml:space="preserve">  </w:t>
+      </w:r>
+      <w:r>
+        <w:rPr>
+          <w:rFonts w:ascii="Consolas" w:hAnsi="Consolas"/>
+        </w:rPr>
+        <w:t>};</w:t>
+      </w:r>
+    </w:p>
+    <w:p>
+      <w:pPr>
+        <w:pStyle w:val="Code"/>
+        <w:rPr>
+          <w:rFonts w:ascii="Consolas" w:hAnsi="Consolas"/>
+        </w:rPr>
+      </w:pPr>
+      <w:r>
+        <w:rPr>
+          <w:rFonts w:ascii="Consolas" w:hAnsi="Consolas"/>
+        </w:rPr>
+      </w:r>
+    </w:p>
+    <w:p>
+      <w:pPr>
+        <w:pStyle w:val="Code"/>
+        <w:rPr>
+          <w:rFonts w:ascii="Consolas" w:hAnsi="Consolas"/>
+        </w:rPr>
+      </w:pPr>
+      <w:r>
+        <w:rPr>
+          <w:rFonts w:ascii="Consolas" w:hAnsi="Consolas"/>
+        </w:rPr>
+        <w:t xml:space="preserve">  </w:t>
+      </w:r>
+      <w:r>
+        <w:rPr>
+          <w:rFonts w:ascii="Consolas" w:hAnsi="Consolas"/>
+        </w:rPr>
+        <w:t>return (</w:t>
+      </w:r>
+    </w:p>
+    <w:p>
+      <w:pPr>
+        <w:pStyle w:val="Code"/>
+        <w:rPr>
+          <w:rFonts w:ascii="Consolas" w:hAnsi="Consolas"/>
+        </w:rPr>
+      </w:pPr>
+      <w:r>
+        <w:rPr>
+          <w:rFonts w:ascii="Consolas" w:hAnsi="Consolas"/>
+        </w:rPr>
+        <w:t xml:space="preserve">    </w:t>
+      </w:r>
+      <w:r>
+        <w:rPr>
+          <w:rFonts w:ascii="Consolas" w:hAnsi="Consolas"/>
+        </w:rPr>
+        <w:t>&lt;div className="flex flex-col p-3 gap-3 min-h-screen"&gt;</w:t>
+      </w:r>
+    </w:p>
+    <w:p>
+      <w:pPr>
+        <w:pStyle w:val="Code"/>
+        <w:rPr>
+          <w:rFonts w:ascii="Consolas" w:hAnsi="Consolas"/>
+        </w:rPr>
+      </w:pPr>
+      <w:r>
+        <w:rPr>
+          <w:rFonts w:ascii="Consolas" w:hAnsi="Consolas"/>
+        </w:rPr>
+        <w:t xml:space="preserve">      </w:t>
+      </w:r>
+      <w:r>
+        <w:rPr>
+          <w:rFonts w:ascii="Consolas" w:hAnsi="Consolas"/>
+        </w:rPr>
+        <w:t>&lt;textarea</w:t>
+      </w:r>
+    </w:p>
+    <w:p>
+      <w:pPr>
+        <w:pStyle w:val="Code"/>
+        <w:rPr>
+          <w:rFonts w:ascii="Consolas" w:hAnsi="Consolas"/>
+        </w:rPr>
+      </w:pPr>
+      <w:r>
+        <w:rPr>
+          <w:rFonts w:ascii="Consolas" w:hAnsi="Consolas"/>
+        </w:rPr>
+        <w:t xml:space="preserve">        </w:t>
+      </w:r>
+      <w:r>
+        <w:rPr>
+          <w:rFonts w:ascii="Consolas" w:hAnsi="Consolas"/>
+        </w:rPr>
+        <w:t>className="resize-none textarea w-full flex-1 font-mono"</w:t>
+      </w:r>
+    </w:p>
+    <w:p>
+      <w:pPr>
+        <w:pStyle w:val="Code"/>
+        <w:rPr>
+          <w:rFonts w:ascii="Consolas" w:hAnsi="Consolas"/>
+        </w:rPr>
+      </w:pPr>
+      <w:r>
+        <w:rPr>
+          <w:rFonts w:ascii="Consolas" w:hAnsi="Consolas"/>
+        </w:rPr>
+        <w:t xml:space="preserve">        </w:t>
+      </w:r>
+      <w:r>
+        <w:rPr>
+          <w:rFonts w:ascii="Consolas" w:hAnsi="Consolas"/>
+        </w:rPr>
+        <w:t>name="input"</w:t>
+      </w:r>
+    </w:p>
+    <w:p>
+      <w:pPr>
+        <w:pStyle w:val="Code"/>
+        <w:rPr>
+          <w:rFonts w:ascii="Consolas" w:hAnsi="Consolas"/>
+        </w:rPr>
+      </w:pPr>
+      <w:r>
+        <w:rPr>
+          <w:rFonts w:ascii="Consolas" w:hAnsi="Consolas"/>
+        </w:rPr>
+        <w:t xml:space="preserve">        </w:t>
+      </w:r>
+      <w:r>
+        <w:rPr>
+          <w:rFonts w:ascii="Consolas" w:hAnsi="Consolas"/>
+        </w:rPr>
+        <w:t>value={value}</w:t>
+      </w:r>
+    </w:p>
+    <w:p>
+      <w:pPr>
+        <w:pStyle w:val="Code"/>
+        <w:rPr>
+          <w:rFonts w:ascii="Consolas" w:hAnsi="Consolas"/>
+        </w:rPr>
+      </w:pPr>
+      <w:r>
+        <w:rPr>
+          <w:rFonts w:ascii="Consolas" w:hAnsi="Consolas"/>
+        </w:rPr>
+        <w:t xml:space="preserve">        </w:t>
+      </w:r>
+      <w:r>
+        <w:rPr>
+          <w:rFonts w:ascii="Consolas" w:hAnsi="Consolas"/>
+        </w:rPr>
+        <w:t>onChange={(e) =&gt; setValue(e.target.value)}</w:t>
+      </w:r>
+    </w:p>
+    <w:p>
+      <w:pPr>
+        <w:pStyle w:val="Code"/>
+        <w:rPr>
+          <w:rFonts w:ascii="Consolas" w:hAnsi="Consolas"/>
+        </w:rPr>
+      </w:pPr>
+      <w:r>
+        <w:rPr>
+          <w:rFonts w:ascii="Consolas" w:hAnsi="Consolas"/>
+        </w:rPr>
+        <w:t xml:space="preserve">      </w:t>
+      </w:r>
+      <w:r>
+        <w:rPr>
+          <w:rFonts w:ascii="Consolas" w:hAnsi="Consolas"/>
+        </w:rPr>
+        <w:t>/&gt;</w:t>
+      </w:r>
+    </w:p>
+    <w:p>
+      <w:pPr>
+        <w:pStyle w:val="Code"/>
+        <w:rPr>
+          <w:rFonts w:ascii="Consolas" w:hAnsi="Consolas"/>
+        </w:rPr>
+      </w:pPr>
+      <w:r>
+        <w:rPr>
+          <w:rFonts w:ascii="Consolas" w:hAnsi="Consolas"/>
+        </w:rPr>
+        <w:t xml:space="preserve">      </w:t>
+      </w:r>
+      <w:r>
+        <w:rPr>
+          <w:rFonts w:ascii="Consolas" w:hAnsi="Consolas"/>
+        </w:rPr>
+        <w:t>&lt;textarea</w:t>
+      </w:r>
+    </w:p>
+    <w:p>
+      <w:pPr>
+        <w:pStyle w:val="Code"/>
+        <w:rPr>
+          <w:rFonts w:ascii="Consolas" w:hAnsi="Consolas"/>
+        </w:rPr>
+      </w:pPr>
+      <w:r>
+        <w:rPr>
+          <w:rFonts w:ascii="Consolas" w:hAnsi="Consolas"/>
+        </w:rPr>
+        <w:t xml:space="preserve">        </w:t>
+      </w:r>
+      <w:r>
+        <w:rPr>
+          <w:rFonts w:ascii="Consolas" w:hAnsi="Consolas"/>
+        </w:rPr>
+        <w:t>className="resize-none textarea w-full bg-gray-50"</w:t>
+      </w:r>
+    </w:p>
+    <w:p>
+      <w:pPr>
+        <w:pStyle w:val="Code"/>
+        <w:rPr>
+          <w:rFonts w:ascii="Consolas" w:hAnsi="Consolas"/>
+        </w:rPr>
+      </w:pPr>
+      <w:r>
+        <w:rPr>
+          <w:rFonts w:ascii="Consolas" w:hAnsi="Consolas"/>
+        </w:rPr>
+        <w:t xml:space="preserve">        </w:t>
+      </w:r>
+      <w:r>
+        <w:rPr>
+          <w:rFonts w:ascii="Consolas" w:hAnsi="Consolas"/>
+        </w:rPr>
+        <w:t>name="input"</w:t>
+      </w:r>
+    </w:p>
+    <w:p>
+      <w:pPr>
+        <w:pStyle w:val="Code"/>
+        <w:rPr>
+          <w:rFonts w:ascii="Consolas" w:hAnsi="Consolas"/>
+        </w:rPr>
+      </w:pPr>
+      <w:r>
+        <w:rPr>
+          <w:rFonts w:ascii="Consolas" w:hAnsi="Consolas"/>
+        </w:rPr>
+        <w:t xml:space="preserve">        </w:t>
+      </w:r>
+      <w:r>
+        <w:rPr>
+          <w:rFonts w:ascii="Consolas" w:hAnsi="Consolas"/>
+        </w:rPr>
+        <w:t>readOnly</w:t>
+      </w:r>
+    </w:p>
+    <w:p>
+      <w:pPr>
+        <w:pStyle w:val="Code"/>
+        <w:rPr>
+          <w:rFonts w:ascii="Consolas" w:hAnsi="Consolas"/>
+        </w:rPr>
+      </w:pPr>
+      <w:r>
+        <w:rPr>
+          <w:rFonts w:ascii="Consolas" w:hAnsi="Consolas"/>
+        </w:rPr>
+        <w:t xml:space="preserve">        </w:t>
+      </w:r>
+      <w:r>
+        <w:rPr>
+          <w:rFonts w:ascii="Consolas" w:hAnsi="Consolas"/>
+        </w:rPr>
+        <w:t>rows={7}</w:t>
+      </w:r>
+    </w:p>
+    <w:p>
+      <w:pPr>
+        <w:pStyle w:val="Code"/>
+        <w:rPr>
+          <w:rFonts w:ascii="Consolas" w:hAnsi="Consolas"/>
+        </w:rPr>
+      </w:pPr>
+      <w:r>
+        <w:rPr>
+          <w:rFonts w:ascii="Consolas" w:hAnsi="Consolas"/>
+        </w:rPr>
+        <w:t xml:space="preserve">        </w:t>
+      </w:r>
+      <w:r>
+        <w:rPr>
+          <w:rFonts w:ascii="Consolas" w:hAnsi="Consolas"/>
+        </w:rPr>
+        <w:t>value={result}</w:t>
+      </w:r>
+    </w:p>
+    <w:p>
+      <w:pPr>
+        <w:pStyle w:val="Code"/>
+        <w:rPr>
+          <w:rFonts w:ascii="Consolas" w:hAnsi="Consolas"/>
+        </w:rPr>
+      </w:pPr>
+      <w:r>
+        <w:rPr>
+          <w:rFonts w:ascii="Consolas" w:hAnsi="Consolas"/>
+        </w:rPr>
+        <w:t xml:space="preserve">        </w:t>
+      </w:r>
+      <w:r>
+        <w:rPr>
+          <w:rFonts w:ascii="Consolas" w:hAnsi="Consolas"/>
+        </w:rPr>
+        <w:t>onClick={() =&gt; navigator.clipboard.writeText(result)}</w:t>
+      </w:r>
+    </w:p>
+    <w:p>
+      <w:pPr>
+        <w:pStyle w:val="Code"/>
+        <w:rPr>
+          <w:rFonts w:ascii="Consolas" w:hAnsi="Consolas"/>
+        </w:rPr>
+      </w:pPr>
+      <w:r>
+        <w:rPr>
+          <w:rFonts w:ascii="Consolas" w:hAnsi="Consolas"/>
+        </w:rPr>
+        <w:t xml:space="preserve">      </w:t>
+      </w:r>
+      <w:r>
+        <w:rPr>
+          <w:rFonts w:ascii="Consolas" w:hAnsi="Consolas"/>
+        </w:rPr>
+        <w:t>/&gt;</w:t>
+      </w:r>
+    </w:p>
+    <w:p>
+      <w:pPr>
+        <w:pStyle w:val="Code"/>
+        <w:rPr>
+          <w:rFonts w:ascii="Consolas" w:hAnsi="Consolas"/>
+        </w:rPr>
+      </w:pPr>
+      <w:r>
+        <w:rPr>
+          <w:rFonts w:ascii="Consolas" w:hAnsi="Consolas"/>
+        </w:rPr>
+        <w:t xml:space="preserve">      </w:t>
+      </w:r>
+      <w:r>
+        <w:rPr>
+          <w:rFonts w:ascii="Consolas" w:hAnsi="Consolas"/>
+        </w:rPr>
+        <w:t>&lt;button className="btn" onClick={calculateResult}&gt;</w:t>
+      </w:r>
+    </w:p>
+    <w:p>
+      <w:pPr>
+        <w:pStyle w:val="Code"/>
+        <w:rPr>
+          <w:rFonts w:ascii="Consolas" w:hAnsi="Consolas"/>
+        </w:rPr>
+      </w:pPr>
+      <w:r>
+        <w:rPr>
+          <w:rFonts w:ascii="Consolas" w:hAnsi="Consolas"/>
+        </w:rPr>
+        <w:t xml:space="preserve">        </w:t>
+      </w:r>
+      <w:r>
+        <w:rPr>
+          <w:rFonts w:ascii="Consolas" w:hAnsi="Consolas"/>
+        </w:rPr>
+        <w:t>Run</w:t>
+      </w:r>
+    </w:p>
+    <w:p>
+      <w:pPr>
+        <w:pStyle w:val="Code"/>
+        <w:rPr>
+          <w:rFonts w:ascii="Consolas" w:hAnsi="Consolas"/>
+        </w:rPr>
+      </w:pPr>
+      <w:r>
+        <w:rPr>
+          <w:rFonts w:ascii="Consolas" w:hAnsi="Consolas"/>
+        </w:rPr>
+        <w:t xml:space="preserve">      </w:t>
+      </w:r>
+      <w:r>
+        <w:rPr>
+          <w:rFonts w:ascii="Consolas" w:hAnsi="Consolas"/>
+        </w:rPr>
+        <w:t>&lt;/button&gt;</w:t>
+      </w:r>
+    </w:p>
+    <w:p>
+      <w:pPr>
+        <w:pStyle w:val="Code"/>
+        <w:rPr>
+          <w:rFonts w:ascii="Consolas" w:hAnsi="Consolas"/>
+        </w:rPr>
+      </w:pPr>
+      <w:r>
+        <w:rPr>
+          <w:rFonts w:ascii="Consolas" w:hAnsi="Consolas"/>
+        </w:rPr>
+        <w:t xml:space="preserve">    </w:t>
+      </w:r>
+      <w:r>
+        <w:rPr>
+          <w:rFonts w:ascii="Consolas" w:hAnsi="Consolas"/>
+        </w:rPr>
+        <w:t>&lt;/div&gt;</w:t>
+      </w:r>
+    </w:p>
+    <w:p>
+      <w:pPr>
+        <w:pStyle w:val="Code"/>
+        <w:rPr>
+          <w:rFonts w:ascii="Consolas" w:hAnsi="Consolas"/>
+        </w:rPr>
+      </w:pPr>
+      <w:r>
+        <w:rPr>
+          <w:rFonts w:ascii="Consolas" w:hAnsi="Consolas"/>
+        </w:rPr>
+        <w:t xml:space="preserve">  </w:t>
+      </w:r>
+      <w:r>
+        <w:rPr>
+          <w:rFonts w:ascii="Consolas" w:hAnsi="Consolas"/>
+        </w:rPr>
+        <w:t>);</w:t>
+      </w:r>
+    </w:p>
+    <w:p>
+      <w:pPr>
+        <w:pStyle w:val="Code"/>
+        <w:rPr>
+          <w:rFonts w:ascii="Consolas" w:hAnsi="Consolas"/>
+        </w:rPr>
+      </w:pPr>
+      <w:r>
+        <w:rPr>
+          <w:rFonts w:ascii="Consolas" w:hAnsi="Consolas"/>
+        </w:rPr>
+        <w:t>}</w:t>
+      </w:r>
+    </w:p>
+    <w:p>
+      <w:pPr>
+        <w:pStyle w:val="P1"/>
+        <w:rPr/>
+      </w:pPr>
+      <w:r>
+        <w:rPr/>
+      </w:r>
+    </w:p>
+    <w:p>
+      <w:pPr>
+        <w:pStyle w:val="H2"/>
+        <w:rPr/>
+      </w:pPr>
+      <w:r>
+        <w:rPr/>
+        <w:t>Результати</w:t>
+      </w:r>
+    </w:p>
+    <w:p>
+      <w:pPr>
+        <w:pStyle w:val="p11"/>
         <w:ind w:hanging="0" w:left="0"/>
         <w:rPr>
           <w:color w:val="auto"/>
@@ -795,7 +1588,82 @@
         <w:rPr>
           <w:color w:val="auto"/>
         </w:rPr>
-        <w:t>Питання</w:t>
+      </w:r>
+    </w:p>
+    <w:p>
+      <w:pPr>
+        <w:pStyle w:val="p11"/>
+        <w:rPr/>
+      </w:pPr>
+      <w:r>
+        <w:rPr/>
+        <w:t>Результати роботи застосунку на рисунку 1.1 нижче:</w:t>
+      </w:r>
+    </w:p>
+    <w:p>
+      <w:pPr>
+        <w:pStyle w:val="p11"/>
+        <w:rPr/>
+      </w:pPr>
+      <w:r>
+        <w:rPr/>
+      </w:r>
+    </w:p>
+    <w:p>
+      <w:pPr>
+        <w:pStyle w:val="img1"/>
+        <w:rPr/>
+      </w:pPr>
+      <w:r>
+        <w:rPr/>
+        <w:drawing>
+          <wp:inline distT="0" distB="0" distL="0" distR="0">
+            <wp:extent cx="5731510" cy="6872605"/>
+            <wp:effectExtent l="0" t="0" r="0" b="0"/>
+            <wp:docPr id="1" name="Зображення1"/>
+            <wp:cNvGraphicFramePr>
+              <a:graphicFrameLocks xmlns:a="http://schemas.openxmlformats.org/drawingml/2006/main" noChangeAspect="1"/>
+            </wp:cNvGraphicFramePr>
+            <a:graphic xmlns:a="http://schemas.openxmlformats.org/drawingml/2006/main">
+              <a:graphicData uri="http://schemas.openxmlformats.org/drawingml/2006/picture">
+                <pic:pic xmlns:pic="http://schemas.openxmlformats.org/drawingml/2006/picture">
+                  <pic:nvPicPr>
+                    <pic:cNvPr id="1" name="Зображення1"/>
+                    <pic:cNvPicPr>
+                      <a:picLocks noChangeAspect="1" noChangeArrowheads="1"/>
+                    </pic:cNvPicPr>
+                  </pic:nvPicPr>
+                  <pic:blipFill>
+                    <a:blip r:embed="rId2"/>
+                    <a:stretch>
+                      <a:fillRect/>
+                    </a:stretch>
+                  </pic:blipFill>
+                  <pic:spPr bwMode="auto">
+                    <a:xfrm>
+                      <a:off x="0" y="0"/>
+                      <a:ext cx="5731510" cy="6872605"/>
+                    </a:xfrm>
+                    <a:prstGeom prst="rect">
+                      <a:avLst/>
+                    </a:prstGeom>
+                    <a:noFill/>
+                  </pic:spPr>
+                </pic:pic>
+              </a:graphicData>
+            </a:graphic>
+          </wp:inline>
+        </w:drawing>
+      </w:r>
+    </w:p>
+    <w:p>
+      <w:pPr>
+        <w:pStyle w:val="img1"/>
+        <w:rPr/>
+      </w:pPr>
+      <w:r>
+        <w:rPr/>
+        <w:t>Рисунок 1.1 — Вигляд програми</w:t>
       </w:r>
     </w:p>
     <w:sectPr>
@@ -834,7 +1702,7 @@
     <w:pPr>
       <w:widowControl/>
       <w:suppressAutoHyphens w:val="true"/>
-      <w:overflowPunct w:val="true"/>
+      <w:overflowPunct w:val="false"/>
       <w:bidi w:val="0"/>
       <w:spacing w:lineRule="auto" w:line="360" w:before="0" w:after="0"/>
       <w:ind w:firstLine="851"/>
@@ -1173,12 +2041,12 @@
       <w:lang w:val="en-US" w:eastAsia="uk-UA"/>
     </w:rPr>
   </w:style>
-  <w:style w:type="character" w:styleId="Style12">
-    <w:name w:val="Символ нумерації"/>
+  <w:style w:type="character" w:styleId="user">
+    <w:name w:val="Символ нумерації (user)"/>
     <w:qFormat/>
     <w:rPr/>
   </w:style>
-  <w:style w:type="paragraph" w:styleId="Style13">
+  <w:style w:type="paragraph" w:styleId="Style12">
     <w:name w:val="Заголовок"/>
     <w:basedOn w:val="Normal"/>
     <w:next w:val="BodyText"/>
@@ -1188,7 +2056,7 @@
       <w:spacing w:before="240" w:after="120"/>
     </w:pPr>
     <w:rPr>
-      <w:rFonts w:ascii="Liberation Sans" w:hAnsi="Liberation Sans" w:eastAsia="Microsoft YaHei" w:cs="Lucida Sans"/>
+      <w:rFonts w:ascii="Liberation Sans" w:hAnsi="Liberation Sans" w:eastAsia="Microsoft YaHei" w:cs="Arial Unicode MS"/>
       <w:sz w:val="28"/>
       <w:szCs w:val="28"/>
     </w:rPr>
@@ -1225,7 +2093,7 @@
       <w:szCs w:val="24"/>
     </w:rPr>
   </w:style>
-  <w:style w:type="paragraph" w:styleId="Style14">
+  <w:style w:type="paragraph" w:styleId="Style13">
     <w:name w:val="Покажчик"/>
     <w:basedOn w:val="Normal"/>
     <w:qFormat/>
@@ -1233,10 +2101,10 @@
       <w:suppressLineNumbers/>
     </w:pPr>
     <w:rPr>
-      <w:rFonts w:cs="Lucida Sans"/>
-    </w:rPr>
-  </w:style>
-  <w:style w:type="paragraph" w:styleId="user">
+      <w:rFonts w:cs="Arial Unicode MS"/>
+    </w:rPr>
+  </w:style>
+  <w:style w:type="paragraph" w:styleId="user1">
     <w:name w:val="Заголовок (user)"/>
     <w:basedOn w:val="Normal"/>
     <w:next w:val="BodyText"/>
@@ -1246,12 +2114,12 @@
       <w:spacing w:before="240" w:after="120"/>
     </w:pPr>
     <w:rPr>
-      <w:rFonts w:ascii="Liberation Sans" w:hAnsi="Liberation Sans" w:eastAsia="Microsoft YaHei" w:cs="Arial Unicode MS"/>
+      <w:rFonts w:ascii="Liberation Sans" w:hAnsi="Liberation Sans" w:eastAsia="Microsoft YaHei" w:cs="Lucida Sans"/>
       <w:sz w:val="28"/>
       <w:szCs w:val="28"/>
     </w:rPr>
   </w:style>
-  <w:style w:type="paragraph" w:styleId="user1">
+  <w:style w:type="paragraph" w:styleId="user2">
     <w:name w:val="Покажчик (user)"/>
     <w:basedOn w:val="Normal"/>
     <w:qFormat/>
@@ -1259,12 +2127,12 @@
       <w:suppressLineNumbers/>
     </w:pPr>
     <w:rPr>
-      <w:rFonts w:cs="Arial Unicode MS"/>
+      <w:rFonts w:cs="Lucida Sans"/>
     </w:rPr>
   </w:style>
   <w:style w:type="paragraph" w:styleId="IndexHeading">
     <w:name w:val="index heading"/>
-    <w:basedOn w:val="user"/>
+    <w:basedOn w:val="Style12"/>
     <w:pPr/>
     <w:rPr/>
   </w:style>
@@ -1521,8 +2389,8 @@
     </w:pPr>
     <w:rPr/>
   </w:style>
-  <w:style w:type="paragraph" w:styleId="user2">
-    <w:name w:val="Верхній і нижній колонтитули (user)"/>
+  <w:style w:type="paragraph" w:styleId="Style14">
+    <w:name w:val="Верхній і нижній колонтитули"/>
     <w:basedOn w:val="Normal"/>
     <w:qFormat/>
     <w:pPr>
@@ -1535,8 +2403,8 @@
     </w:pPr>
     <w:rPr/>
   </w:style>
-  <w:style w:type="paragraph" w:styleId="Style15">
-    <w:name w:val="Верхній і нижній колонтитули"/>
+  <w:style w:type="paragraph" w:styleId="user3">
+    <w:name w:val="Верхній і нижній колонтитули (user)"/>
     <w:basedOn w:val="Normal"/>
     <w:qFormat/>
     <w:pPr/>
@@ -1544,14 +2412,14 @@
   </w:style>
   <w:style w:type="paragraph" w:styleId="Footer">
     <w:name w:val="footer"/>
-    <w:basedOn w:val="user2"/>
+    <w:basedOn w:val="Style14"/>
     <w:pPr>
       <w:suppressLineNumbers/>
     </w:pPr>
     <w:rPr/>
   </w:style>
-  <w:style w:type="paragraph" w:styleId="user3">
-    <w:name w:val="Вміст рамки (user)"/>
+  <w:style w:type="paragraph" w:styleId="Style15">
+    <w:name w:val="Вміст рамки"/>
     <w:basedOn w:val="Normal"/>
     <w:qFormat/>
     <w:pPr/>
@@ -1559,7 +2427,7 @@
   </w:style>
   <w:style w:type="paragraph" w:styleId="Header">
     <w:name w:val="header"/>
-    <w:basedOn w:val="Style15"/>
+    <w:basedOn w:val="user3"/>
     <w:pPr>
       <w:suppressLineNumbers/>
       <w:tabs>
@@ -1570,8 +2438,8 @@
     </w:pPr>
     <w:rPr/>
   </w:style>
-  <w:style w:type="numbering" w:styleId="user4">
-    <w:name w:val="Без маркерів (user)"/>
+  <w:style w:type="numbering" w:styleId="Style16">
+    <w:name w:val="Без маркерів"/>
     <w:qFormat/>
   </w:style>
 </w:styles>

</xml_diff>